<commit_message>
docs: add GitHub repository URL to documentation and reports
</commit_message>
<xml_diff>
--- a/ISE2_MLFLOW_DOCUMENTATION.docx
+++ b/ISE2_MLFLOW_DOCUMENTATION.docx
@@ -2438,11 +2438,11 @@
     </w:p>
     <w:p>
       <w:r>
-        <w:t>• GitHub Repository URL: [To be added upon repository push]</w:t>
+        <w:t>• GitHub Repository URL: https://github.com/Tanish-19/iris-mlflow-drift</w:t>
         <w:br/>
         <w:t>• Local Repository Root: /Users/tanishpatgaonkar/.gemini/antigravity-ide/scratch/iris-mlflow-drift</w:t>
         <w:br/>
-        <w:t>• Configured Branch: main (Git repository initialized, clean local commits, ready for GitHub remote addition).</w:t>
+        <w:t>• Configured Branch: main (Git repository initialized, clean local commits, synced with remote origin).</w:t>
       </w:r>
     </w:p>
     <w:p>

</xml_diff>